<commit_message>
Add related experiences section to detail page (BAE-PRD-RELATED-EXP-v1.0)
- experience_detail() queries all active non-mystery experiences excluding current, ordered by sort_order
- New _related_experiences.html partial: horizontal scroll on mobile, 2-col tablet, 3-col desktop
- price_block macro, discount badge, rating row, jeepWrangler.webp fallback, hover animations
- bae-related-* CSS appended to custom.css
- SEO: meta description + keywords added to base, index, experiences, contact, providers/apply

Co-Authored-By: Claude Sonnet 4.6 <noreply@anthropic.com>
</commit_message>
<xml_diff>
--- a/docs/BAE_Featured_PRD_v1.0.docx
+++ b/docs/BAE_Featured_PRD_v1.0.docx
@@ -1805,7 +1805,7 @@
           <w:sz w:val="22"/>
           <w:szCs w:val="22"/>
         </w:rPr>
-        <w:t xml:space="preserve">Each selected experience must have at least 1 timeslot where: slot_date is between today and today + 7 days AND bookings_confirmed &lt; guest_capacity</w:t>
+        <w:t xml:space="preserve">Each selected experience must have at least 1 timeslot where: slot_date is strictly greater than today (tomorrow or later) and up to today + 7 days AND bookings_confirmed &lt; guest_capacity</w:t>
       </w:r>
     </w:p>
     <w:p>
@@ -2709,7 +2709,7 @@
     available_exp_ids = (
         db.session.query(Timeslot.experience_id)
         .filter(
-            Timeslot.slot_date  &gt;= today,
+            Timeslot.slot_date  &gt;  today,   # strictly future — today excluded
             Timeslot.slot_date  &lt;= week_end,
             Timeslot.is_active  == True,
             Timeslot.slots_remaining &gt; 0,
@@ -2732,7 +2732,7 @@
         slots = (
             Timeslot.query.filter(
                 Timeslot.experience_id   == exp.experience_id,
-                Timeslot.slot_date       &gt;= today,
+                Timeslot.slot_date       &gt;  today,   # strictly future — today excluded
                 Timeslot.slot_date       &lt;= week_end,
                 Timeslot.is_active       == True,
                 Timeslot.slots_remaining &gt; 0,
@@ -3752,7 +3752,7 @@
     available_ids = (
         db.session.query(Timeslot.experience_id)
         .filter(
-            Timeslot.slot_date      &gt;= today,
+            Timeslot.slot_date      &gt;  today,   # strictly future — today excluded
             Timeslot.slot_date      &lt;= week_end,
             Timeslot.is_active      == True,
             Timeslot.slots_remaining &gt; 0,
@@ -3771,7 +3771,7 @@
             Timeslot.query
             .filter(
                 Timeslot.experience_id   == exp.experience_id,
-                Timeslot.slot_date       &gt;= today,
+                Timeslot.slot_date       &gt;  today,   # strictly future — today excluded
                 Timeslot.slot_date       &lt;= week_end,
                 Timeslot.is_active       == True,
                 Timeslot.slots_remaining &gt; 0,
@@ -7439,6 +7439,274 @@
                 <w:sz w:val="18"/>
                 <w:szCs w:val="18"/>
               </w:rPr>
+              <w:t xml:space="preserve">Timeslot with slot_date = today (same day)</w:t>
+            </w:r>
+          </w:p>
+        </w:tc>
+        <w:tc>
+          <w:tcPr>
+            <w:tcBorders>
+              <w:top w:val="single" w:color="CCCCCC" w:sz="1"/>
+              <w:left w:val="single" w:color="CCCCCC" w:sz="1"/>
+              <w:bottom w:val="single" w:color="CCCCCC" w:sz="1"/>
+              <w:right w:val="single" w:color="CCCCCC" w:sz="1"/>
+            </w:tcBorders>
+            <w:shd w:fill="FFFFFF" w:val="clear"/>
+            <w:tcMar>
+              <w:top w:type="dxa" w:w="60"/>
+              <w:left w:type="dxa" w:w="90"/>
+              <w:bottom w:type="dxa" w:w="60"/>
+              <w:right w:type="dxa" w:w="90"/>
+            </w:tcMar>
+          </w:tcPr>
+          <w:p>
+            <w:pPr>
+              <w:jc w:val="left"/>
+            </w:pPr>
+            <w:r>
+              <w:rPr>
+                <w:rFonts w:ascii="Arial" w:cs="Arial" w:eastAsia="Arial" w:hAnsi="Arial"/>
+                <w:b w:val="false"/>
+                <w:bCs w:val="false"/>
+                <w:color w:val="1C1C1E"/>
+                <w:sz w:val="18"/>
+                <w:szCs w:val="18"/>
+              </w:rPr>
+              <w:t xml:space="preserve">NOT shown — slot_date &gt; today strictly excludes today; only tomorrow or later displayed</w:t>
+            </w:r>
+          </w:p>
+        </w:tc>
+        <w:tc>
+          <w:tcPr>
+            <w:tcBorders>
+              <w:top w:val="single" w:color="CCCCCC" w:sz="1"/>
+              <w:left w:val="single" w:color="CCCCCC" w:sz="1"/>
+              <w:bottom w:val="single" w:color="CCCCCC" w:sz="1"/>
+              <w:right w:val="single" w:color="CCCCCC" w:sz="1"/>
+            </w:tcBorders>
+            <w:shd w:fill="FFFFFF" w:val="clear"/>
+            <w:tcMar>
+              <w:top w:type="dxa" w:w="60"/>
+              <w:left w:type="dxa" w:w="90"/>
+              <w:bottom w:type="dxa" w:w="60"/>
+              <w:right w:type="dxa" w:w="90"/>
+            </w:tcMar>
+          </w:tcPr>
+          <w:p>
+            <w:pPr>
+              <w:jc w:val="left"/>
+            </w:pPr>
+            <w:r>
+              <w:rPr>
+                <w:rFonts w:ascii="Arial" w:cs="Arial" w:eastAsia="Arial" w:hAnsi="Arial"/>
+                <w:b w:val="false"/>
+                <w:bCs w:val="false"/>
+                <w:color w:val="1C1C1E"/>
+                <w:sz w:val="18"/>
+                <w:szCs w:val="18"/>
+              </w:rPr>
+              <w:t xml:space="preserve">Logic</w:t>
+            </w:r>
+          </w:p>
+        </w:tc>
+      </w:tr>
+      <w:tr>
+        <w:tc>
+          <w:tcPr>
+            <w:tcBorders>
+              <w:top w:val="single" w:color="CCCCCC" w:sz="1"/>
+              <w:left w:val="single" w:color="CCCCCC" w:sz="1"/>
+              <w:bottom w:val="single" w:color="CCCCCC" w:sz="1"/>
+              <w:right w:val="single" w:color="CCCCCC" w:sz="1"/>
+            </w:tcBorders>
+            <w:shd w:fill="EFF4F9" w:val="clear"/>
+            <w:tcMar>
+              <w:top w:type="dxa" w:w="60"/>
+              <w:left w:type="dxa" w:w="90"/>
+              <w:bottom w:type="dxa" w:w="60"/>
+              <w:right w:type="dxa" w:w="90"/>
+            </w:tcMar>
+          </w:tcPr>
+          <w:p>
+            <w:pPr>
+              <w:jc w:val="center"/>
+            </w:pPr>
+            <w:r>
+              <w:rPr>
+                <w:rFonts w:ascii="Arial" w:cs="Arial" w:eastAsia="Arial" w:hAnsi="Arial"/>
+                <w:b/>
+                <w:bCs/>
+                <w:color w:val="1A3557"/>
+                <w:sz w:val="18"/>
+                <w:szCs w:val="18"/>
+              </w:rPr>
+              <w:t xml:space="preserve">23b</w:t>
+            </w:r>
+          </w:p>
+        </w:tc>
+        <w:tc>
+          <w:tcPr>
+            <w:tcBorders>
+              <w:top w:val="single" w:color="CCCCCC" w:sz="1"/>
+              <w:left w:val="single" w:color="CCCCCC" w:sz="1"/>
+              <w:bottom w:val="single" w:color="CCCCCC" w:sz="1"/>
+              <w:right w:val="single" w:color="CCCCCC" w:sz="1"/>
+            </w:tcBorders>
+            <w:shd w:fill="EFF4F9" w:val="clear"/>
+            <w:tcMar>
+              <w:top w:type="dxa" w:w="60"/>
+              <w:left w:type="dxa" w:w="90"/>
+              <w:bottom w:type="dxa" w:w="60"/>
+              <w:right w:type="dxa" w:w="90"/>
+            </w:tcMar>
+          </w:tcPr>
+          <w:p>
+            <w:pPr>
+              <w:jc w:val="left"/>
+            </w:pPr>
+            <w:r>
+              <w:rPr>
+                <w:rFonts w:ascii="Arial" w:cs="Arial" w:eastAsia="Arial" w:hAnsi="Arial"/>
+                <w:b w:val="false"/>
+                <w:bCs w:val="false"/>
+                <w:color w:val="1C1C1E"/>
+                <w:sz w:val="18"/>
+                <w:szCs w:val="18"/>
+              </w:rPr>
+              <w:t xml:space="preserve">Timeslot with slot_date = tomorrow</w:t>
+            </w:r>
+          </w:p>
+        </w:tc>
+        <w:tc>
+          <w:tcPr>
+            <w:tcBorders>
+              <w:top w:val="single" w:color="CCCCCC" w:sz="1"/>
+              <w:left w:val="single" w:color="CCCCCC" w:sz="1"/>
+              <w:bottom w:val="single" w:color="CCCCCC" w:sz="1"/>
+              <w:right w:val="single" w:color="CCCCCC" w:sz="1"/>
+            </w:tcBorders>
+            <w:shd w:fill="EFF4F9" w:val="clear"/>
+            <w:tcMar>
+              <w:top w:type="dxa" w:w="60"/>
+              <w:left w:type="dxa" w:w="90"/>
+              <w:bottom w:type="dxa" w:w="60"/>
+              <w:right w:type="dxa" w:w="90"/>
+            </w:tcMar>
+          </w:tcPr>
+          <w:p>
+            <w:pPr>
+              <w:jc w:val="left"/>
+            </w:pPr>
+            <w:r>
+              <w:rPr>
+                <w:rFonts w:ascii="Arial" w:cs="Arial" w:eastAsia="Arial" w:hAnsi="Arial"/>
+                <w:b w:val="false"/>
+                <w:bCs w:val="false"/>
+                <w:color w:val="1C1C1E"/>
+                <w:sz w:val="18"/>
+                <w:szCs w:val="18"/>
+              </w:rPr>
+              <w:t xml:space="preserve">Shown — slot_date &gt; today passes; pill renders correctly e.g. 'Thu Apr 16'</w:t>
+            </w:r>
+          </w:p>
+        </w:tc>
+        <w:tc>
+          <w:tcPr>
+            <w:tcBorders>
+              <w:top w:val="single" w:color="CCCCCC" w:sz="1"/>
+              <w:left w:val="single" w:color="CCCCCC" w:sz="1"/>
+              <w:bottom w:val="single" w:color="CCCCCC" w:sz="1"/>
+              <w:right w:val="single" w:color="CCCCCC" w:sz="1"/>
+            </w:tcBorders>
+            <w:shd w:fill="EFF4F9" w:val="clear"/>
+            <w:tcMar>
+              <w:top w:type="dxa" w:w="60"/>
+              <w:left w:type="dxa" w:w="90"/>
+              <w:bottom w:type="dxa" w:w="60"/>
+              <w:right w:type="dxa" w:w="90"/>
+            </w:tcMar>
+          </w:tcPr>
+          <w:p>
+            <w:pPr>
+              <w:jc w:val="left"/>
+            </w:pPr>
+            <w:r>
+              <w:rPr>
+                <w:rFonts w:ascii="Arial" w:cs="Arial" w:eastAsia="Arial" w:hAnsi="Arial"/>
+                <w:b w:val="false"/>
+                <w:bCs w:val="false"/>
+                <w:color w:val="1C1C1E"/>
+                <w:sz w:val="18"/>
+                <w:szCs w:val="18"/>
+              </w:rPr>
+              <w:t xml:space="preserve">Logic</w:t>
+            </w:r>
+          </w:p>
+        </w:tc>
+      </w:tr>
+      <w:tr>
+        <w:tc>
+          <w:tcPr>
+            <w:tcBorders>
+              <w:top w:val="single" w:color="CCCCCC" w:sz="1"/>
+              <w:left w:val="single" w:color="CCCCCC" w:sz="1"/>
+              <w:bottom w:val="single" w:color="CCCCCC" w:sz="1"/>
+              <w:right w:val="single" w:color="CCCCCC" w:sz="1"/>
+            </w:tcBorders>
+            <w:shd w:fill="FFFFFF" w:val="clear"/>
+            <w:tcMar>
+              <w:top w:type="dxa" w:w="60"/>
+              <w:left w:type="dxa" w:w="90"/>
+              <w:bottom w:type="dxa" w:w="60"/>
+              <w:right w:type="dxa" w:w="90"/>
+            </w:tcMar>
+          </w:tcPr>
+          <w:p>
+            <w:pPr>
+              <w:jc w:val="center"/>
+            </w:pPr>
+            <w:r>
+              <w:rPr>
+                <w:rFonts w:ascii="Arial" w:cs="Arial" w:eastAsia="Arial" w:hAnsi="Arial"/>
+                <w:b/>
+                <w:bCs/>
+                <w:color w:val="1A3557"/>
+                <w:sz w:val="18"/>
+                <w:szCs w:val="18"/>
+              </w:rPr>
+              <w:t xml:space="preserve">24</w:t>
+            </w:r>
+          </w:p>
+        </w:tc>
+        <w:tc>
+          <w:tcPr>
+            <w:tcBorders>
+              <w:top w:val="single" w:color="CCCCCC" w:sz="1"/>
+              <w:left w:val="single" w:color="CCCCCC" w:sz="1"/>
+              <w:bottom w:val="single" w:color="CCCCCC" w:sz="1"/>
+              <w:right w:val="single" w:color="CCCCCC" w:sz="1"/>
+            </w:tcBorders>
+            <w:shd w:fill="FFFFFF" w:val="clear"/>
+            <w:tcMar>
+              <w:top w:type="dxa" w:w="60"/>
+              <w:left w:type="dxa" w:w="90"/>
+              <w:bottom w:type="dxa" w:w="60"/>
+              <w:right w:type="dxa" w:w="90"/>
+            </w:tcMar>
+          </w:tcPr>
+          <w:p>
+            <w:pPr>
+              <w:jc w:val="left"/>
+            </w:pPr>
+            <w:r>
+              <w:rPr>
+                <w:rFonts w:ascii="Arial" w:cs="Arial" w:eastAsia="Arial" w:hAnsi="Arial"/>
+                <w:b w:val="false"/>
+                <w:bCs w:val="false"/>
+                <w:color w:val="1C1C1E"/>
+                <w:sz w:val="18"/>
+                <w:szCs w:val="18"/>
+              </w:rPr>
               <w:t xml:space="preserve">Timeslot.slots_remaining = 0</w:t>
             </w:r>
           </w:p>
@@ -7472,7 +7740,7 @@
                 <w:sz w:val="18"/>
                 <w:szCs w:val="18"/>
               </w:rPr>
-              <w:t xml:space="preserve">That timeslot not included in available_ids subquery</w:t>
+              <w:t xml:space="preserve">Not included in available_ids subquery</w:t>
             </w:r>
           </w:p>
         </w:tc>
@@ -8708,7 +8976,7 @@
                 <w:sz w:val="17"/>
                 <w:szCs w:val="17"/>
               </w:rPr>
-              <w:t xml:space="preserve">Each card's experience has at least 1 timeslot with slots_remaining &gt; 0 in next 7 days</w:t>
+              <w:t xml:space="preserve">Each card's experience has at least 1 timeslot with slot_date &gt; today (strictly future) and slots_remaining &gt; 0 within next 7 days — today's date is never shown</w:t>
             </w:r>
           </w:p>
         </w:tc>

</xml_diff>